<commit_message>
implemented routing.py and fix the critical -> high -> normal priority
</commit_message>
<xml_diff>
--- a/RLA.docx
+++ b/RLA.docx
@@ -256,15 +256,7 @@
         <w:t xml:space="preserve">Me:  </w:t>
       </w:r>
       <w:r>
-        <w:t xml:space="preserve">Are there peak days of the week other than </w:t>
-      </w:r>
-      <w:proofErr w:type="spellStart"/>
-      <w:r>
-        <w:t>monday</w:t>
-      </w:r>
-      <w:proofErr w:type="spellEnd"/>
-      <w:r>
-        <w:t>?</w:t>
+        <w:t>Are there peak days of the week other than monday?</w:t>
       </w:r>
     </w:p>
     <w:p>
@@ -705,23 +697,7 @@
           <w:b/>
           <w:bCs/>
         </w:rPr>
-        <w:t xml:space="preserve">7–8 </w:t>
-      </w:r>
-      <w:proofErr w:type="spellStart"/>
-      <w:r>
-        <w:rPr>
-          <w:b/>
-          <w:bCs/>
-        </w:rPr>
-        <w:t>liters</w:t>
-      </w:r>
-      <w:proofErr w:type="spellEnd"/>
-      <w:r>
-        <w:rPr>
-          <w:b/>
-          <w:bCs/>
-        </w:rPr>
-        <w:t xml:space="preserve"> per 100 km</w:t>
+        <w:t>7–8 liters per 100 km</w:t>
       </w:r>
       <w:r>
         <w:t xml:space="preserve"> in city driving — Paris traffic doesn’t help.</w:t>
@@ -749,23 +725,7 @@
           <w:b/>
           <w:bCs/>
         </w:rPr>
-        <w:t xml:space="preserve">10–12 </w:t>
-      </w:r>
-      <w:proofErr w:type="spellStart"/>
-      <w:r>
-        <w:rPr>
-          <w:b/>
-          <w:bCs/>
-        </w:rPr>
-        <w:t>liters</w:t>
-      </w:r>
-      <w:proofErr w:type="spellEnd"/>
-      <w:r>
-        <w:rPr>
-          <w:b/>
-          <w:bCs/>
-        </w:rPr>
-        <w:t xml:space="preserve"> per 100 km</w:t>
+        <w:t>10–12 liters per 100 km</w:t>
       </w:r>
       <w:r>
         <w:t>, especially on suburban runs with heavier loads.</w:t>
@@ -793,23 +753,7 @@
           <w:b/>
           <w:bCs/>
         </w:rPr>
-        <w:t xml:space="preserve">12–14 </w:t>
-      </w:r>
-      <w:proofErr w:type="spellStart"/>
-      <w:r>
-        <w:rPr>
-          <w:b/>
-          <w:bCs/>
-        </w:rPr>
-        <w:t>liters</w:t>
-      </w:r>
-      <w:proofErr w:type="spellEnd"/>
-      <w:r>
-        <w:rPr>
-          <w:b/>
-          <w:bCs/>
-        </w:rPr>
-        <w:t xml:space="preserve"> per 100 km</w:t>
+        <w:t>12–14 liters per 100 km</w:t>
       </w:r>
       <w:r>
         <w:t>, and a bit more when the fridge unit is working all day.</w:t>
@@ -2828,6 +2772,9 @@
     </w:p>
     <w:p>
       <w:r>
+        <w:rPr>
+          <w:noProof/>
+        </w:rPr>
         <w:drawing>
           <wp:inline distT="0" distB="0" distL="0" distR="0" wp14:anchorId="0F788251" wp14:editId="21C872F1">
             <wp:extent cx="1828800" cy="1828800"/>
@@ -2965,15 +2912,7 @@
     </w:p>
     <w:p>
       <w:r>
-        <w:t xml:space="preserve">so you only give that to other driver if </w:t>
-      </w:r>
-      <w:proofErr w:type="spellStart"/>
-      <w:r>
-        <w:t>thats</w:t>
-      </w:r>
-      <w:proofErr w:type="spellEnd"/>
-      <w:r>
-        <w:t xml:space="preserve"> a high priority delivery ?</w:t>
+        <w:t>so you only give that to other driver if thats a high priority delivery ?</w:t>
       </w:r>
     </w:p>
     <w:p>
@@ -2993,6 +2932,9 @@
     </w:p>
     <w:p>
       <w:r>
+        <w:rPr>
+          <w:noProof/>
+        </w:rPr>
         <w:drawing>
           <wp:inline distT="0" distB="0" distL="0" distR="0" wp14:anchorId="1D2C1241" wp14:editId="1BE65189">
             <wp:extent cx="1828800" cy="1828800"/>
@@ -3145,6 +3087,9 @@
     </w:p>
     <w:p>
       <w:r>
+        <w:rPr>
+          <w:noProof/>
+        </w:rPr>
         <w:drawing>
           <wp:inline distT="0" distB="0" distL="0" distR="0" wp14:anchorId="3EC4FD43" wp14:editId="6BE4AE72">
             <wp:extent cx="1828800" cy="1828800"/>
@@ -3295,19 +3240,9 @@
       </w:r>
     </w:p>
     <w:p>
-      <w:proofErr w:type="spellStart"/>
-      <w:r>
-        <w:t>i</w:t>
-      </w:r>
-      <w:proofErr w:type="spellEnd"/>
-      <w:r>
-        <w:t xml:space="preserve"> want to know how drivers are assigned the deliveries ? is it based on the vehicle or </w:t>
-      </w:r>
-      <w:proofErr w:type="spellStart"/>
-      <w:r>
-        <w:t>waht</w:t>
-      </w:r>
-      <w:proofErr w:type="spellEnd"/>
+      <w:r>
+        <w:t>i want to know how drivers are assigned the deliveries ? is it based on the vehicle or waht</w:t>
+      </w:r>
     </w:p>
     <w:p>
       <w:pPr>
@@ -3326,6 +3261,9 @@
     </w:p>
     <w:p>
       <w:r>
+        <w:rPr>
+          <w:noProof/>
+        </w:rPr>
         <w:drawing>
           <wp:inline distT="0" distB="0" distL="0" distR="0" wp14:anchorId="2634CF47" wp14:editId="18266A0D">
             <wp:extent cx="1828800" cy="1828800"/>
@@ -3460,15 +3398,7 @@
     <w:p>
       <w:r>
         <w:lastRenderedPageBreak/>
-        <w:t xml:space="preserve">suppose we have a driver who </w:t>
-      </w:r>
-      <w:proofErr w:type="spellStart"/>
-      <w:r>
-        <w:t>isnt</w:t>
-      </w:r>
-      <w:proofErr w:type="spellEnd"/>
-      <w:r>
-        <w:t xml:space="preserve"> certified to drive a freezing van but van goes in his zone </w:t>
+        <w:t xml:space="preserve">suppose we have a driver who isnt certified to drive a freezing van but van goes in his zone </w:t>
       </w:r>
     </w:p>
     <w:p>
@@ -3488,6 +3418,9 @@
     </w:p>
     <w:p>
       <w:r>
+        <w:rPr>
+          <w:noProof/>
+        </w:rPr>
         <w:drawing>
           <wp:inline distT="0" distB="0" distL="0" distR="0" wp14:anchorId="5300ABC3" wp14:editId="3A33F0B4">
             <wp:extent cx="1828800" cy="1828800"/>
@@ -3639,15 +3572,7 @@
     </w:p>
     <w:p>
       <w:r>
-        <w:t xml:space="preserve">means in this case zone </w:t>
-      </w:r>
-      <w:proofErr w:type="spellStart"/>
-      <w:r>
-        <w:t>doesnt</w:t>
-      </w:r>
-      <w:proofErr w:type="spellEnd"/>
-      <w:r>
-        <w:t xml:space="preserve"> matter</w:t>
+        <w:t>means in this case zone doesnt matter</w:t>
       </w:r>
     </w:p>
     <w:p>
@@ -3667,6 +3592,9 @@
     </w:p>
     <w:p>
       <w:r>
+        <w:rPr>
+          <w:noProof/>
+        </w:rPr>
         <w:drawing>
           <wp:inline distT="0" distB="0" distL="0" distR="0" wp14:anchorId="5BCA30EE" wp14:editId="5FCA704C">
             <wp:extent cx="1828800" cy="1828800"/>
@@ -3799,6 +3727,267 @@
       </w:r>
     </w:p>
     <w:p/>
+    <w:p>
+      <w:r>
+        <w:t>we have 3 stops critical high priority and normal priority</w:t>
+      </w:r>
+      <w:r>
+        <w:br/>
+        <w:t>so we always deal critical first according to which is nearest then high and then normal according to nearest is it correct</w:t>
+      </w:r>
+    </w:p>
+    <w:p>
+      <w:pPr>
+        <w:rPr>
+          <w:b/>
+          <w:bCs/>
+        </w:rPr>
+      </w:pPr>
+      <w:r>
+        <w:rPr>
+          <w:b/>
+          <w:bCs/>
+        </w:rPr>
+        <w:t>RLA 2 : Delivery Company CEO said:</w:t>
+      </w:r>
+    </w:p>
+    <w:p>
+      <w:r>
+        <w:drawing>
+          <wp:inline distT="0" distB="0" distL="0" distR="0" wp14:anchorId="17014CE2" wp14:editId="16514907">
+            <wp:extent cx="1828800" cy="1828800"/>
+            <wp:effectExtent l="0" t="0" r="0" b="0"/>
+            <wp:docPr id="709479331" name="Picture 2" descr="RLA 2 : Delivery Company CEO"/>
+            <wp:cNvGraphicFramePr>
+              <a:graphicFrameLocks xmlns:a="http://schemas.openxmlformats.org/drawingml/2006/main" noChangeAspect="1"/>
+            </wp:cNvGraphicFramePr>
+            <a:graphic xmlns:a="http://schemas.openxmlformats.org/drawingml/2006/main">
+              <a:graphicData uri="http://schemas.openxmlformats.org/drawingml/2006/picture">
+                <pic:pic xmlns:pic="http://schemas.openxmlformats.org/drawingml/2006/picture">
+                  <pic:nvPicPr>
+                    <pic:cNvPr id="0" name="Picture 6" descr="RLA 2 : Delivery Company CEO"/>
+                    <pic:cNvPicPr>
+                      <a:picLocks noChangeAspect="1" noChangeArrowheads="1"/>
+                    </pic:cNvPicPr>
+                  </pic:nvPicPr>
+                  <pic:blipFill>
+                    <a:blip r:embed="rId5">
+                      <a:extLst>
+                        <a:ext uri="{28A0092B-C50C-407E-A947-70E740481C1C}">
+                          <a14:useLocalDpi xmlns:a14="http://schemas.microsoft.com/office/drawing/2010/main" val="0"/>
+                        </a:ext>
+                      </a:extLst>
+                    </a:blip>
+                    <a:srcRect/>
+                    <a:stretch>
+                      <a:fillRect/>
+                    </a:stretch>
+                  </pic:blipFill>
+                  <pic:spPr bwMode="auto">
+                    <a:xfrm>
+                      <a:off x="0" y="0"/>
+                      <a:ext cx="1828800" cy="1828800"/>
+                    </a:xfrm>
+                    <a:prstGeom prst="rect">
+                      <a:avLst/>
+                    </a:prstGeom>
+                    <a:noFill/>
+                    <a:ln>
+                      <a:noFill/>
+                    </a:ln>
+                  </pic:spPr>
+                </pic:pic>
+              </a:graphicData>
+            </a:graphic>
+          </wp:inline>
+        </w:drawing>
+      </w:r>
+    </w:p>
+    <w:p>
+      <w:pPr>
+        <w:rPr>
+          <w:b/>
+          <w:bCs/>
+        </w:rPr>
+      </w:pPr>
+      <w:r>
+        <w:rPr>
+          <w:b/>
+          <w:bCs/>
+        </w:rPr>
+        <w:t>RLA 2 : Delivery Company CEO</w:t>
+      </w:r>
+    </w:p>
+    <w:p>
+      <w:r>
+        <w:t>Broadly speaking — </w:t>
+      </w:r>
+      <w:r>
+        <w:rPr>
+          <w:b/>
+          <w:bCs/>
+        </w:rPr>
+        <w:t>yes, that logic is correct</w:t>
+      </w:r>
+      <w:r>
+        <w:t>, and it matches how we operate </w:t>
+      </w:r>
+      <w:r>
+        <w:rPr>
+          <w:b/>
+          <w:bCs/>
+        </w:rPr>
+        <w:t>in real life</w:t>
+      </w:r>
+      <w:r>
+        <w:t>.</w:t>
+      </w:r>
+    </w:p>
+    <w:p>
+      <w:r>
+        <w:t>We always </w:t>
+      </w:r>
+      <w:r>
+        <w:rPr>
+          <w:b/>
+          <w:bCs/>
+        </w:rPr>
+        <w:t>separate by priority first</w:t>
+      </w:r>
+      <w:r>
+        <w:t>, not by distance:</w:t>
+      </w:r>
+    </w:p>
+    <w:p>
+      <w:pPr>
+        <w:numPr>
+          <w:ilvl w:val="0"/>
+          <w:numId w:val="5"/>
+        </w:numPr>
+      </w:pPr>
+      <w:r>
+        <w:rPr>
+          <w:b/>
+          <w:bCs/>
+        </w:rPr>
+        <w:t>Critical deliveries first</w:t>
+      </w:r>
+    </w:p>
+    <w:p>
+      <w:pPr>
+        <w:numPr>
+          <w:ilvl w:val="0"/>
+          <w:numId w:val="5"/>
+        </w:numPr>
+      </w:pPr>
+      <w:r>
+        <w:t>Then </w:t>
+      </w:r>
+      <w:r>
+        <w:rPr>
+          <w:b/>
+          <w:bCs/>
+        </w:rPr>
+        <w:t>high priority</w:t>
+      </w:r>
+    </w:p>
+    <w:p>
+      <w:pPr>
+        <w:numPr>
+          <w:ilvl w:val="0"/>
+          <w:numId w:val="5"/>
+        </w:numPr>
+      </w:pPr>
+      <w:r>
+        <w:t>Then </w:t>
+      </w:r>
+      <w:r>
+        <w:rPr>
+          <w:b/>
+          <w:bCs/>
+        </w:rPr>
+        <w:t>normal</w:t>
+      </w:r>
+    </w:p>
+    <w:p>
+      <w:r>
+        <w:t>And </w:t>
+      </w:r>
+      <w:r>
+        <w:rPr>
+          <w:b/>
+          <w:bCs/>
+        </w:rPr>
+        <w:t>within each priority level</w:t>
+      </w:r>
+      <w:r>
+        <w:t>, we usually choose the </w:t>
+      </w:r>
+      <w:r>
+        <w:rPr>
+          <w:b/>
+          <w:bCs/>
+        </w:rPr>
+        <w:t>nearest or most efficient order</w:t>
+      </w:r>
+      <w:r>
+        <w:t>, </w:t>
+      </w:r>
+      <w:r>
+        <w:rPr>
+          <w:i/>
+          <w:iCs/>
+        </w:rPr>
+        <w:t>as long as it doesn’t put a deadline at risk</w:t>
+      </w:r>
+      <w:r>
+        <w:t>.</w:t>
+      </w:r>
+    </w:p>
+    <w:p>
+      <w:r>
+        <w:t>So your rule becomes:</w:t>
+      </w:r>
+    </w:p>
+    <w:p>
+      <w:r>
+        <w:rPr>
+          <w:b/>
+          <w:bCs/>
+        </w:rPr>
+        <w:t>Priority first, distance second</w:t>
+      </w:r>
+    </w:p>
+    <w:p>
+      <w:r>
+        <w:t>That’s exactly it. Distance helps </w:t>
+      </w:r>
+      <w:r>
+        <w:rPr>
+          <w:i/>
+          <w:iCs/>
+        </w:rPr>
+        <w:t>optimize</w:t>
+      </w:r>
+      <w:r>
+        <w:t>, but it </w:t>
+      </w:r>
+      <w:r>
+        <w:rPr>
+          <w:b/>
+          <w:bCs/>
+        </w:rPr>
+        <w:t>never overrides priority or time windows</w:t>
+      </w:r>
+      <w:r>
+        <w:t>. If a critical delivery is a bit farther but has a tight deadline, it goes first — no debate. This is why a purely “nearest</w:t>
+      </w:r>
+      <w:r>
+        <w:noBreakHyphen/>
+        <w:t>neighbor” approach doesn’t work for us in medical delivery.</w:t>
+      </w:r>
+    </w:p>
+    <w:p/>
     <w:p/>
     <w:p/>
     <w:p/>
@@ -3975,6 +4164,119 @@
     </w:lvl>
   </w:abstractNum>
   <w:abstractNum w:abstractNumId="1" w15:restartNumberingAfterBreak="0">
+    <w:nsid w:val="44EB3DE5"/>
+    <w:multiLevelType w:val="multilevel"/>
+    <w:tmpl w:val="65583800"/>
+    <w:lvl w:ilvl="0">
+      <w:start w:val="1"/>
+      <w:numFmt w:val="decimal"/>
+      <w:lvlText w:val="%1."/>
+      <w:lvlJc w:val="left"/>
+      <w:pPr>
+        <w:tabs>
+          <w:tab w:val="num" w:pos="720"/>
+        </w:tabs>
+        <w:ind w:left="720" w:hanging="360"/>
+      </w:pPr>
+    </w:lvl>
+    <w:lvl w:ilvl="1" w:tentative="1">
+      <w:start w:val="1"/>
+      <w:numFmt w:val="decimal"/>
+      <w:lvlText w:val="%2."/>
+      <w:lvlJc w:val="left"/>
+      <w:pPr>
+        <w:tabs>
+          <w:tab w:val="num" w:pos="1440"/>
+        </w:tabs>
+        <w:ind w:left="1440" w:hanging="360"/>
+      </w:pPr>
+    </w:lvl>
+    <w:lvl w:ilvl="2" w:tentative="1">
+      <w:start w:val="1"/>
+      <w:numFmt w:val="decimal"/>
+      <w:lvlText w:val="%3."/>
+      <w:lvlJc w:val="left"/>
+      <w:pPr>
+        <w:tabs>
+          <w:tab w:val="num" w:pos="2160"/>
+        </w:tabs>
+        <w:ind w:left="2160" w:hanging="360"/>
+      </w:pPr>
+    </w:lvl>
+    <w:lvl w:ilvl="3" w:tentative="1">
+      <w:start w:val="1"/>
+      <w:numFmt w:val="decimal"/>
+      <w:lvlText w:val="%4."/>
+      <w:lvlJc w:val="left"/>
+      <w:pPr>
+        <w:tabs>
+          <w:tab w:val="num" w:pos="2880"/>
+        </w:tabs>
+        <w:ind w:left="2880" w:hanging="360"/>
+      </w:pPr>
+    </w:lvl>
+    <w:lvl w:ilvl="4" w:tentative="1">
+      <w:start w:val="1"/>
+      <w:numFmt w:val="decimal"/>
+      <w:lvlText w:val="%5."/>
+      <w:lvlJc w:val="left"/>
+      <w:pPr>
+        <w:tabs>
+          <w:tab w:val="num" w:pos="3600"/>
+        </w:tabs>
+        <w:ind w:left="3600" w:hanging="360"/>
+      </w:pPr>
+    </w:lvl>
+    <w:lvl w:ilvl="5" w:tentative="1">
+      <w:start w:val="1"/>
+      <w:numFmt w:val="decimal"/>
+      <w:lvlText w:val="%6."/>
+      <w:lvlJc w:val="left"/>
+      <w:pPr>
+        <w:tabs>
+          <w:tab w:val="num" w:pos="4320"/>
+        </w:tabs>
+        <w:ind w:left="4320" w:hanging="360"/>
+      </w:pPr>
+    </w:lvl>
+    <w:lvl w:ilvl="6" w:tentative="1">
+      <w:start w:val="1"/>
+      <w:numFmt w:val="decimal"/>
+      <w:lvlText w:val="%7."/>
+      <w:lvlJc w:val="left"/>
+      <w:pPr>
+        <w:tabs>
+          <w:tab w:val="num" w:pos="5040"/>
+        </w:tabs>
+        <w:ind w:left="5040" w:hanging="360"/>
+      </w:pPr>
+    </w:lvl>
+    <w:lvl w:ilvl="7" w:tentative="1">
+      <w:start w:val="1"/>
+      <w:numFmt w:val="decimal"/>
+      <w:lvlText w:val="%8."/>
+      <w:lvlJc w:val="left"/>
+      <w:pPr>
+        <w:tabs>
+          <w:tab w:val="num" w:pos="5760"/>
+        </w:tabs>
+        <w:ind w:left="5760" w:hanging="360"/>
+      </w:pPr>
+    </w:lvl>
+    <w:lvl w:ilvl="8" w:tentative="1">
+      <w:start w:val="1"/>
+      <w:numFmt w:val="decimal"/>
+      <w:lvlText w:val="%9."/>
+      <w:lvlJc w:val="left"/>
+      <w:pPr>
+        <w:tabs>
+          <w:tab w:val="num" w:pos="6480"/>
+        </w:tabs>
+        <w:ind w:left="6480" w:hanging="360"/>
+      </w:pPr>
+    </w:lvl>
+  </w:abstractNum>
+  <w:abstractNum w:abstractNumId="2" w15:restartNumberingAfterBreak="0">
     <w:nsid w:val="664079B5"/>
     <w:multiLevelType w:val="multilevel"/>
     <w:tmpl w:val="D31205A6"/>
@@ -4123,7 +4425,7 @@
       </w:rPr>
     </w:lvl>
   </w:abstractNum>
-  <w:abstractNum w:abstractNumId="2" w15:restartNumberingAfterBreak="0">
+  <w:abstractNum w:abstractNumId="3" w15:restartNumberingAfterBreak="0">
     <w:nsid w:val="690522AA"/>
     <w:multiLevelType w:val="multilevel"/>
     <w:tmpl w:val="2716E066"/>
@@ -4272,7 +4574,7 @@
       </w:rPr>
     </w:lvl>
   </w:abstractNum>
-  <w:abstractNum w:abstractNumId="3" w15:restartNumberingAfterBreak="0">
+  <w:abstractNum w:abstractNumId="4" w15:restartNumberingAfterBreak="0">
     <w:nsid w:val="7C9A72EB"/>
     <w:multiLevelType w:val="multilevel"/>
     <w:tmpl w:val="C7A45722"/>
@@ -4422,16 +4724,19 @@
     </w:lvl>
   </w:abstractNum>
   <w:num w:numId="1" w16cid:durableId="602037561">
-    <w:abstractNumId w:val="3"/>
+    <w:abstractNumId w:val="4"/>
   </w:num>
   <w:num w:numId="2" w16cid:durableId="759109380">
     <w:abstractNumId w:val="0"/>
   </w:num>
   <w:num w:numId="3" w16cid:durableId="339698357">
-    <w:abstractNumId w:val="1"/>
+    <w:abstractNumId w:val="2"/>
   </w:num>
   <w:num w:numId="4" w16cid:durableId="495920998">
-    <w:abstractNumId w:val="2"/>
+    <w:abstractNumId w:val="3"/>
+  </w:num>
+  <w:num w:numId="5" w16cid:durableId="1737967280">
+    <w:abstractNumId w:val="1"/>
   </w:num>
 </w:numbering>
 </file>

</xml_diff>

<commit_message>
Implemented cache and xls file geocache
</commit_message>
<xml_diff>
--- a/RLA.docx
+++ b/RLA.docx
@@ -256,7 +256,15 @@
         <w:t xml:space="preserve">Me:  </w:t>
       </w:r>
       <w:r>
-        <w:t>Are there peak days of the week other than monday?</w:t>
+        <w:t xml:space="preserve">Are there peak days of the week other than </w:t>
+      </w:r>
+      <w:proofErr w:type="spellStart"/>
+      <w:r>
+        <w:t>monday</w:t>
+      </w:r>
+      <w:proofErr w:type="spellEnd"/>
+      <w:r>
+        <w:t>?</w:t>
       </w:r>
     </w:p>
     <w:p>
@@ -697,7 +705,23 @@
           <w:b/>
           <w:bCs/>
         </w:rPr>
-        <w:t>7–8 liters per 100 km</w:t>
+        <w:t xml:space="preserve">7–8 </w:t>
+      </w:r>
+      <w:proofErr w:type="spellStart"/>
+      <w:r>
+        <w:rPr>
+          <w:b/>
+          <w:bCs/>
+        </w:rPr>
+        <w:t>liters</w:t>
+      </w:r>
+      <w:proofErr w:type="spellEnd"/>
+      <w:r>
+        <w:rPr>
+          <w:b/>
+          <w:bCs/>
+        </w:rPr>
+        <w:t xml:space="preserve"> per 100 km</w:t>
       </w:r>
       <w:r>
         <w:t xml:space="preserve"> in city driving — Paris traffic doesn’t help.</w:t>
@@ -725,7 +749,23 @@
           <w:b/>
           <w:bCs/>
         </w:rPr>
-        <w:t>10–12 liters per 100 km</w:t>
+        <w:t xml:space="preserve">10–12 </w:t>
+      </w:r>
+      <w:proofErr w:type="spellStart"/>
+      <w:r>
+        <w:rPr>
+          <w:b/>
+          <w:bCs/>
+        </w:rPr>
+        <w:t>liters</w:t>
+      </w:r>
+      <w:proofErr w:type="spellEnd"/>
+      <w:r>
+        <w:rPr>
+          <w:b/>
+          <w:bCs/>
+        </w:rPr>
+        <w:t xml:space="preserve"> per 100 km</w:t>
       </w:r>
       <w:r>
         <w:t>, especially on suburban runs with heavier loads.</w:t>
@@ -753,7 +793,23 @@
           <w:b/>
           <w:bCs/>
         </w:rPr>
-        <w:t>12–14 liters per 100 km</w:t>
+        <w:t xml:space="preserve">12–14 </w:t>
+      </w:r>
+      <w:proofErr w:type="spellStart"/>
+      <w:r>
+        <w:rPr>
+          <w:b/>
+          <w:bCs/>
+        </w:rPr>
+        <w:t>liters</w:t>
+      </w:r>
+      <w:proofErr w:type="spellEnd"/>
+      <w:r>
+        <w:rPr>
+          <w:b/>
+          <w:bCs/>
+        </w:rPr>
+        <w:t xml:space="preserve"> per 100 km</w:t>
       </w:r>
       <w:r>
         <w:t>, and a bit more when the fridge unit is working all day.</w:t>
@@ -2912,7 +2968,15 @@
     </w:p>
     <w:p>
       <w:r>
-        <w:t>so you only give that to other driver if thats a high priority delivery ?</w:t>
+        <w:t xml:space="preserve">so you only give that to other driver if </w:t>
+      </w:r>
+      <w:proofErr w:type="spellStart"/>
+      <w:r>
+        <w:t>thats</w:t>
+      </w:r>
+      <w:proofErr w:type="spellEnd"/>
+      <w:r>
+        <w:t xml:space="preserve"> a high priority delivery ?</w:t>
       </w:r>
     </w:p>
     <w:p>
@@ -3240,9 +3304,19 @@
       </w:r>
     </w:p>
     <w:p>
-      <w:r>
-        <w:t>i want to know how drivers are assigned the deliveries ? is it based on the vehicle or waht</w:t>
-      </w:r>
+      <w:proofErr w:type="spellStart"/>
+      <w:r>
+        <w:t>i</w:t>
+      </w:r>
+      <w:proofErr w:type="spellEnd"/>
+      <w:r>
+        <w:t xml:space="preserve"> want to know how drivers are assigned the deliveries ? is it based on the vehicle or </w:t>
+      </w:r>
+      <w:proofErr w:type="spellStart"/>
+      <w:r>
+        <w:t>waht</w:t>
+      </w:r>
+      <w:proofErr w:type="spellEnd"/>
     </w:p>
     <w:p>
       <w:pPr>
@@ -3398,7 +3472,15 @@
     <w:p>
       <w:r>
         <w:lastRenderedPageBreak/>
-        <w:t xml:space="preserve">suppose we have a driver who isnt certified to drive a freezing van but van goes in his zone </w:t>
+        <w:t xml:space="preserve">suppose we have a driver who </w:t>
+      </w:r>
+      <w:proofErr w:type="spellStart"/>
+      <w:r>
+        <w:t>isnt</w:t>
+      </w:r>
+      <w:proofErr w:type="spellEnd"/>
+      <w:r>
+        <w:t xml:space="preserve"> certified to drive a freezing van but van goes in his zone </w:t>
       </w:r>
     </w:p>
     <w:p>
@@ -3572,7 +3654,15 @@
     </w:p>
     <w:p>
       <w:r>
-        <w:t>means in this case zone doesnt matter</w:t>
+        <w:t xml:space="preserve">means in this case zone </w:t>
+      </w:r>
+      <w:proofErr w:type="spellStart"/>
+      <w:r>
+        <w:t>doesnt</w:t>
+      </w:r>
+      <w:proofErr w:type="spellEnd"/>
+      <w:r>
+        <w:t xml:space="preserve"> matter</w:t>
       </w:r>
     </w:p>
     <w:p>
@@ -3753,6 +3843,9 @@
     </w:p>
     <w:p>
       <w:r>
+        <w:rPr>
+          <w:noProof/>
+        </w:rPr>
         <w:drawing>
           <wp:inline distT="0" distB="0" distL="0" distR="0" wp14:anchorId="17014CE2" wp14:editId="16514907">
             <wp:extent cx="1828800" cy="1828800"/>
@@ -3984,9 +4077,224 @@
       </w:r>
       <w:r>
         <w:noBreakHyphen/>
-        <w:t>neighbor” approach doesn’t work for us in medical delivery.</w:t>
-      </w:r>
-    </w:p>
+      </w:r>
+      <w:proofErr w:type="spellStart"/>
+      <w:r>
+        <w:t>neighbor</w:t>
+      </w:r>
+      <w:proofErr w:type="spellEnd"/>
+      <w:r>
+        <w:t>” approach doesn’t work for us in medical delivery.</w:t>
+      </w:r>
+    </w:p>
+    <w:p/>
+    <w:p/>
+    <w:p/>
+    <w:p/>
+    <w:p>
+      <w:r>
+        <w:t xml:space="preserve">in the solution that </w:t>
+      </w:r>
+      <w:proofErr w:type="spellStart"/>
+      <w:r>
+        <w:t>i</w:t>
+      </w:r>
+      <w:proofErr w:type="spellEnd"/>
+      <w:r>
+        <w:t xml:space="preserve"> am </w:t>
+      </w:r>
+      <w:proofErr w:type="spellStart"/>
+      <w:r>
+        <w:t>gonna</w:t>
+      </w:r>
+      <w:proofErr w:type="spellEnd"/>
+      <w:r>
+        <w:t xml:space="preserve"> proposed you do you want me to handle the fuel consumption thing ? or you leave that </w:t>
+      </w:r>
+      <w:proofErr w:type="spellStart"/>
+      <w:r>
+        <w:t>upto</w:t>
+      </w:r>
+      <w:proofErr w:type="spellEnd"/>
+      <w:r>
+        <w:t xml:space="preserve"> the driver ?</w:t>
+      </w:r>
+    </w:p>
+    <w:p>
+      <w:pPr>
+        <w:rPr>
+          <w:b/>
+          <w:bCs/>
+        </w:rPr>
+      </w:pPr>
+      <w:r>
+        <w:rPr>
+          <w:b/>
+          <w:bCs/>
+        </w:rPr>
+        <w:t>RLA 2 : Delivery Company CEO said:</w:t>
+      </w:r>
+    </w:p>
+    <w:p>
+      <w:r>
+        <w:lastRenderedPageBreak/>
+        <w:drawing>
+          <wp:inline distT="0" distB="0" distL="0" distR="0" wp14:anchorId="0CB015F5" wp14:editId="1EC4BDEF">
+            <wp:extent cx="1828800" cy="1828800"/>
+            <wp:effectExtent l="0" t="0" r="0" b="0"/>
+            <wp:docPr id="2099551365" name="Picture 2" descr="RLA 2 : Delivery Company CEO"/>
+            <wp:cNvGraphicFramePr>
+              <a:graphicFrameLocks xmlns:a="http://schemas.openxmlformats.org/drawingml/2006/main" noChangeAspect="1"/>
+            </wp:cNvGraphicFramePr>
+            <a:graphic xmlns:a="http://schemas.openxmlformats.org/drawingml/2006/main">
+              <a:graphicData uri="http://schemas.openxmlformats.org/drawingml/2006/picture">
+                <pic:pic xmlns:pic="http://schemas.openxmlformats.org/drawingml/2006/picture">
+                  <pic:nvPicPr>
+                    <pic:cNvPr id="0" name="Picture 6" descr="RLA 2 : Delivery Company CEO"/>
+                    <pic:cNvPicPr>
+                      <a:picLocks noChangeAspect="1" noChangeArrowheads="1"/>
+                    </pic:cNvPicPr>
+                  </pic:nvPicPr>
+                  <pic:blipFill>
+                    <a:blip r:embed="rId5">
+                      <a:extLst>
+                        <a:ext uri="{28A0092B-C50C-407E-A947-70E740481C1C}">
+                          <a14:useLocalDpi xmlns:a14="http://schemas.microsoft.com/office/drawing/2010/main" val="0"/>
+                        </a:ext>
+                      </a:extLst>
+                    </a:blip>
+                    <a:srcRect/>
+                    <a:stretch>
+                      <a:fillRect/>
+                    </a:stretch>
+                  </pic:blipFill>
+                  <pic:spPr bwMode="auto">
+                    <a:xfrm>
+                      <a:off x="0" y="0"/>
+                      <a:ext cx="1828800" cy="1828800"/>
+                    </a:xfrm>
+                    <a:prstGeom prst="rect">
+                      <a:avLst/>
+                    </a:prstGeom>
+                    <a:noFill/>
+                    <a:ln>
+                      <a:noFill/>
+                    </a:ln>
+                  </pic:spPr>
+                </pic:pic>
+              </a:graphicData>
+            </a:graphic>
+          </wp:inline>
+        </w:drawing>
+      </w:r>
+    </w:p>
+    <w:p>
+      <w:pPr>
+        <w:rPr>
+          <w:b/>
+          <w:bCs/>
+        </w:rPr>
+      </w:pPr>
+      <w:r>
+        <w:rPr>
+          <w:b/>
+          <w:bCs/>
+        </w:rPr>
+        <w:t>RLA 2 : Delivery Company CEO</w:t>
+      </w:r>
+    </w:p>
+    <w:p>
+      <w:r>
+        <w:t>Honestly, </w:t>
+      </w:r>
+      <w:r>
+        <w:rPr>
+          <w:b/>
+          <w:bCs/>
+        </w:rPr>
+        <w:t>no — I don’t want you to handle fuel consumption</w:t>
+      </w:r>
+      <w:r>
+        <w:t> in the solution.</w:t>
+      </w:r>
+    </w:p>
+    <w:p>
+      <w:r>
+        <w:t>Fuel matters, of course, but it’s </w:t>
+      </w:r>
+      <w:r>
+        <w:rPr>
+          <w:b/>
+          <w:bCs/>
+        </w:rPr>
+        <w:t>not what keeps me awake at night</w:t>
+      </w:r>
+      <w:r>
+        <w:t>. I trust drivers to take sensible routes and not waste fuel, and small differences there are nothing compared to the cost of a </w:t>
+      </w:r>
+      <w:r>
+        <w:rPr>
+          <w:b/>
+          <w:bCs/>
+        </w:rPr>
+        <w:t>late hospital delivery</w:t>
+      </w:r>
+      <w:r>
+        <w:t> or an angry pharmacy call.</w:t>
+      </w:r>
+    </w:p>
+    <w:p>
+      <w:r>
+        <w:t>If your planning tool </w:t>
+      </w:r>
+      <w:r>
+        <w:rPr>
+          <w:b/>
+          <w:bCs/>
+        </w:rPr>
+        <w:t>doesn’t create obviously inefficient routes</w:t>
+      </w:r>
+      <w:r>
+        <w:t>, that’s enough for me. My priority is </w:t>
+      </w:r>
+      <w:r>
+        <w:rPr>
+          <w:b/>
+          <w:bCs/>
+        </w:rPr>
+        <w:t>on</w:t>
+      </w:r>
+      <w:r>
+        <w:rPr>
+          <w:b/>
+          <w:bCs/>
+        </w:rPr>
+        <w:noBreakHyphen/>
+        <w:t>time, compliant medical delivery</w:t>
+      </w:r>
+      <w:r>
+        <w:t xml:space="preserve">, not squeezing out a few </w:t>
+      </w:r>
+      <w:proofErr w:type="spellStart"/>
+      <w:r>
+        <w:t>liters</w:t>
+      </w:r>
+      <w:proofErr w:type="spellEnd"/>
+      <w:r>
+        <w:t xml:space="preserve"> of fuel. Fuel efficiency stays </w:t>
+      </w:r>
+      <w:r>
+        <w:rPr>
+          <w:b/>
+          <w:bCs/>
+        </w:rPr>
+        <w:t>secondary and mostly in the driver’s hands</w:t>
+      </w:r>
+      <w:r>
+        <w:t>.</w:t>
+      </w:r>
+    </w:p>
+    <w:p/>
     <w:p/>
     <w:p/>
     <w:p/>

</xml_diff>